<commit_message>
ianb motion-brief: complete transcription of FILED-EXAMPLE-motion-brief-2 (fb-w0vj.1)
fb diff --content: G0 PASS (6 pages); G2 residuals template-driven (one signer field; required fax and service date print a placeholder).
</commit_message>
<xml_diff>
--- a/courts/eighth-circuit/iowa/federal/bankruptcy-northern-district/motion-brief/usage/OUTPUT-motion-brief-2.docx
+++ b/courts/eighth-circuit/iowa/federal/bankruptcy-northern-district/motion-brief/usage/OUTPUT-motion-brief-2.docx
@@ -87,7 +87,7 @@
             </w:pPr>
             <w:r>
               <w:rPr/>
-              <w:t xml:space="preserve">VeroBlue Farms USA, Inc.,</w:t>
+              <w:t xml:space="preserve">VeroBlue Farms USA, Inc.</w:t>
             </w:r>
           </w:p>
           <w:p>
@@ -107,7 +107,7 @@
             </w:pPr>
             <w:r>
               <w:rPr/>
-              <w:t xml:space="preserve">VeroBlue Farms USA, Inc.,</w:t>
+              <w:t xml:space="preserve">VeroBlue Farms USA, Inc.</w:t>
             </w:r>
           </w:p>
           <w:p>
@@ -165,7 +165,7 @@
             </w:pPr>
             <w:r>
               <w:rPr/>
-              <w:t xml:space="preserve">Chapter 11 Bankruptcy</w:t>
+              <w:t xml:space="preserve">Chapter 11</w:t>
             </w:r>
           </w:p>
           <w:p>
@@ -174,7 +174,7 @@
             </w:pPr>
             <w:r>
               <w:rPr/>
-              <w:t xml:space="preserve">Bankruptcy No. 18-01297</w:t>
+              <w:t xml:space="preserve">Bankruptcy No: 18-01297</w:t>
             </w:r>
           </w:p>
           <w:p>
@@ -265,6 +265,9 @@
       <w:r>
         <w:t xml:space="preserve">“[t]he court may strike from a pleading…any…immaterial, impertinent, or scandalous matter.”</w:t>
       </w:r>
+      <w:r>
+        <w:t xml:space="preserve">;</w:t>
+      </w:r>
     </w:p>
     <w:p>
       <w:pPr>
@@ -289,7 +292,20 @@
         <w:t xml:space="preserve"> </w:t>
       </w:r>
       <w:r>
-        <w:t xml:space="preserve">51 Wright &amp; Miller, Federal Practice and Procedure § 1380 (2d ed. 1990); Bank of Vermont v. Lyndonville Sav. Bank &amp; Trust Co., 906 F.Supp.221, 228 (D. Vt. 1995) (same);</w:t>
+        <w:t xml:space="preserve">51 Wright &amp; Miller, Federal Practice and Procedure § 1380 (2d ed. 1990);</w:t>
+      </w:r>
+      <w:r>
+        <w:t xml:space="preserve"> </w:t>
+      </w:r>
+      <w:r>
+        <w:rPr>
+          <w:i/>
+          <w:iCs/>
+        </w:rPr>
+        <w:t xml:space="preserve">Bank of Vermont v. Lyndonville Sav. Bank &amp; Trust Co.</w:t>
+      </w:r>
+      <w:r>
+        <w:t xml:space="preserve">, 906 F.Supp.221, 228 (D. Vt. 1995) (same);</w:t>
       </w:r>
     </w:p>
     <w:p>
@@ -841,6 +857,15 @@
             </w:pPr>
             <w:r>
               <w:rPr/>
+              <w:t xml:space="preserve">Brandon M. Schwartz, AT0011248</w:t>
+            </w:r>
+          </w:p>
+          <w:p>
+            <w:pPr>
+              <w:spacing w:before="0" w:after="65" w:line="240" w:lineRule="auto"/>
+            </w:pPr>
+            <w:r>
+              <w:rPr/>
               <w:t xml:space="preserve">600 Inwood Avenue N.</w:t>
             </w:r>
           </w:p>
@@ -895,7 +920,7 @@
             </w:pPr>
             <w:r>
               <w:rPr/>
-              <w:t xml:space="preserve">E-mail: Mschwartz@mdspalaw.com</w:t>
+              <w:t xml:space="preserve">E-mail: Mschwartz@mdspalaw.com Bschwartz@mdspalaw.com</w:t>
             </w:r>
           </w:p>
           <w:p>
@@ -931,7 +956,7 @@
         <w:ind w:firstLine="720"/>
       </w:pPr>
       <w:r>
-        <w:t xml:space="preserve">The undersigned certifies that on [not on the filed copy], electronically on parties who receive electronic notice through CM/ECF as listed on CM/ECF’s notice of electronic filing.</w:t>
+        <w:t xml:space="preserve">The undersigned certifies that on [not on the filed copy], This document was served electronically on parties who receive electronic notice through CM/ECF as listed on CM/ECF’s notice of electronic filing.</w:t>
       </w:r>
     </w:p>
     <w:p>
@@ -1101,7 +1126,23 @@
         <w:t xml:space="preserve"> </w:t>
       </w:r>
       <w:r>
-        <w:t xml:space="preserve">As acknowledged in the Adversary Complaint, Cassels Brock &amp; Blackwell LLP is a Canadian limited liability partnership. See (Doc. No. 3, ¶ 8).</w:t>
+        <w:t xml:space="preserve">As acknowledged in the Adversary Complaint, Cassels Brock &amp; Blackwell LLP is a Canadian limited liability partnership.</w:t>
+      </w:r>
+      <w:r>
+        <w:t xml:space="preserve"> </w:t>
+      </w:r>
+      <w:r>
+        <w:rPr>
+          <w:i/>
+          <w:iCs/>
+        </w:rPr>
+        <w:t xml:space="preserve">See</w:t>
+      </w:r>
+      <w:r>
+        <w:t xml:space="preserve"> </w:t>
+      </w:r>
+      <w:r>
+        <w:t xml:space="preserve">(Doc. No. 3, ¶ 8).</w:t>
       </w:r>
     </w:p>
   </w:footnote>

</xml_diff>